<commit_message>
Fill in résumé placeholders and correct education
The downloadable CV still had unfilled [COMPLETAR: ...] placeholders
for job dates and two metrics (turnaround-time % and team size).
Per the user, dates and those metrics are dropped rather than
fabricated. Also corrects the education line to match the site:
Interactive Design at Fundación Universitaria Bellas Artes (FUBA),
Medellín — it previously said "Visual Arts".
</commit_message>
<xml_diff>
--- a/assets/Luis_Bravo_CV_EN.docx
+++ b/assets/Luis_Bravo_CV_EN.docx
@@ -121,35 +121,20 @@
     </w:p>
     <w:p>
       <w:pPr>
-        <w:spacing w:after="80"/>
-      </w:pPr>
-      <w:r>
-        <w:rPr>
-          <w:i/>
-          <w:iCs/>
-          <w:color w:val="4B564F"/>
-          <w:sz w:val="20"/>
-          <w:szCs w:val="20"/>
-        </w:rPr>
-        <w:t xml:space="preserve">[COMPLETAR: fechas, ej. Ene 2024 – Presente]</w:t>
-      </w:r>
-    </w:p>
-    <w:p>
-      <w:pPr>
-        <w:pStyle w:val="ListParagraph"/>
-        <w:numPr>
-          <w:ilvl w:val="0"/>
-          <w:numId w:val="2"/>
-        </w:numPr>
-        <w:spacing w:after="60"/>
-      </w:pPr>
-      <w:r>
-        <w:rPr>
-          <w:color w:val="1E2420"/>
-          <w:sz w:val="21"/>
-          <w:szCs w:val="21"/>
-        </w:rPr>
-        <w:t xml:space="preserve">Led the studio's transition to AI-integrated creative workflows for image and video production, cutting turnaround time on [COMPLETAR: campaign/asset type] by [COMPLETAR: %].</w:t>
+        <w:pStyle w:val="ListParagraph"/>
+        <w:numPr>
+          <w:ilvl w:val="0"/>
+          <w:numId w:val="2"/>
+        </w:numPr>
+        <w:spacing w:after="60"/>
+      </w:pPr>
+      <w:r>
+        <w:rPr>
+          <w:color w:val="1E2420"/>
+          <w:sz w:val="21"/>
+          <w:szCs w:val="21"/>
+        </w:rPr>
+        <w:t xml:space="preserve">Led the studio's transition to AI-integrated creative workflows for image and video production.</w:t>
       </w:r>
     </w:p>
     <w:p>
@@ -185,7 +170,7 @@
           <w:sz w:val="21"/>
           <w:szCs w:val="21"/>
         </w:rPr>
-        <w:t xml:space="preserve">Trained and directed a creative team of [COMPLETAR: # people] on generative AI tools for content production.</w:t>
+        <w:t xml:space="preserve">Trained and directed a creative team on generative AI tools for content production.</w:t>
       </w:r>
     </w:p>
     <w:p>
@@ -231,21 +216,6 @@
     </w:p>
     <w:p>
       <w:pPr>
-        <w:spacing w:after="80"/>
-      </w:pPr>
-      <w:r>
-        <w:rPr>
-          <w:i/>
-          <w:iCs/>
-          <w:color w:val="4B564F"/>
-          <w:sz w:val="20"/>
-          <w:szCs w:val="20"/>
-        </w:rPr>
-        <w:t xml:space="preserve">[COMPLETAR: fechas]</w:t>
-      </w:r>
-    </w:p>
-    <w:p>
-      <w:pPr>
         <w:pStyle w:val="ListParagraph"/>
         <w:numPr>
           <w:ilvl w:val="0"/>
@@ -319,21 +289,6 @@
           <w:szCs w:val="23"/>
         </w:rPr>
         <w:t xml:space="preserve">  —  Metaskins Studios</w:t>
-      </w:r>
-    </w:p>
-    <w:p>
-      <w:pPr>
-        <w:spacing w:after="80"/>
-      </w:pPr>
-      <w:r>
-        <w:rPr>
-          <w:i/>
-          <w:iCs/>
-          <w:color w:val="4B564F"/>
-          <w:sz w:val="20"/>
-          <w:szCs w:val="20"/>
-        </w:rPr>
-        <w:t xml:space="preserve">[COMPLETAR: fechas]</w:t>
       </w:r>
     </w:p>
     <w:p>
@@ -485,7 +440,7 @@
           <w:sz w:val="21"/>
           <w:szCs w:val="21"/>
         </w:rPr>
-        <w:t xml:space="preserve">Visual Arts — Medellín, Colombia</w:t>
+        <w:t xml:space="preserve">Interactive Design — Fundación Universitaria Bellas Artes (FUBA), Medellín, Colombia</w:t>
       </w:r>
     </w:p>
     <w:p>
@@ -498,7 +453,7 @@
           <w:sz w:val="20"/>
           <w:szCs w:val="20"/>
         </w:rPr>
-        <w:t xml:space="preserve">Coursework in fine arts and audiovisual development</w:t>
+        <w:t xml:space="preserve">Coursework in interactive design and digital media</w:t>
       </w:r>
     </w:p>
     <w:p>

</xml_diff>